<commit_message>
rename concept model file
</commit_message>
<xml_diff>
--- a/docs/source/models/risk_exposures/child_growth_failure/wasting/wasting_state_exposure/WASTING CALIBRATION.docx
+++ b/docs/source/models/risk_exposures/child_growth_failure/wasting/wasting_state_exposure/WASTING CALIBRATION.docx
@@ -1,6 +1,6 @@
 
 <file path=word/document.xml><?xml version="1.0" encoding="utf-8"?>
-<w:document xmlns:wpc="http://schemas.microsoft.com/office/word/2010/wordprocessingCanvas" xmlns:cx="http://schemas.microsoft.com/office/drawing/2014/chartex" xmlns:cx1="http://schemas.microsoft.com/office/drawing/2015/9/8/chartex" xmlns:cx2="http://schemas.microsoft.com/office/drawing/2015/10/21/chartex" xmlns:cx3="http://schemas.microsoft.com/office/drawing/2016/5/9/chartex" xmlns:cx4="http://schemas.microsoft.com/office/drawing/2016/5/10/chartex" xmlns:cx5="http://schemas.microsoft.com/office/drawing/2016/5/11/chartex" xmlns:cx6="http://schemas.microsoft.com/office/drawing/2016/5/12/chartex" xmlns:cx7="http://schemas.microsoft.com/office/drawing/2016/5/13/chartex" xmlns:cx8="http://schemas.microsoft.com/office/drawing/2016/5/14/chartex" xmlns:mc="http://schemas.openxmlformats.org/markup-compatibility/2006" xmlns:aink="http://schemas.microsoft.com/office/drawing/2016/ink" xmlns:am3d="http://schemas.microsoft.com/office/drawing/2017/model3d" xmlns:o="urn:schemas-microsoft-com:office:office" xmlns:oel="http://schemas.microsoft.com/office/2019/extlst" xmlns:r="http://schemas.openxmlformats.org/officeDocument/2006/relationships" xmlns:m="http://schemas.openxmlformats.org/officeDocument/2006/math" xmlns:v="urn:schemas-microsoft-com:vml" xmlns:wp14="http://schemas.microsoft.com/office/word/2010/wordprocessingDrawing" xmlns:wp="http://schemas.openxmlformats.org/drawingml/2006/wordprocessingDrawing" xmlns:w10="urn:schemas-microsoft-com:office:word" xmlns:w="http://schemas.openxmlformats.org/wordprocessingml/2006/main" xmlns:w14="http://schemas.microsoft.com/office/word/2010/wordml" xmlns:w15="http://schemas.microsoft.com/office/word/2012/wordml" xmlns:w16cex="http://schemas.microsoft.com/office/word/2018/wordml/cex" xmlns:w16cid="http://schemas.microsoft.com/office/word/2016/wordml/cid" xmlns:w16="http://schemas.microsoft.com/office/word/2018/wordml" xmlns:w16sdtdh="http://schemas.microsoft.com/office/word/2020/wordml/sdtdatahash" xmlns:w16se="http://schemas.microsoft.com/office/word/2015/wordml/symex" xmlns:wpg="http://schemas.microsoft.com/office/word/2010/wordprocessingGroup" xmlns:wpi="http://schemas.microsoft.com/office/word/2010/wordprocessingInk" xmlns:wne="http://schemas.microsoft.com/office/word/2006/wordml" xmlns:wps="http://schemas.microsoft.com/office/word/2010/wordprocessingShape" mc:Ignorable="w14 w15 w16se w16cid w16 w16cex w16sdtdh wp14">
+<w:document xmlns:wpc="http://schemas.microsoft.com/office/word/2010/wordprocessingCanvas" xmlns:cx="http://schemas.microsoft.com/office/drawing/2014/chartex" xmlns:cx1="http://schemas.microsoft.com/office/drawing/2015/9/8/chartex" xmlns:cx2="http://schemas.microsoft.com/office/drawing/2015/10/21/chartex" xmlns:cx3="http://schemas.microsoft.com/office/drawing/2016/5/9/chartex" xmlns:cx4="http://schemas.microsoft.com/office/drawing/2016/5/10/chartex" xmlns:cx5="http://schemas.microsoft.com/office/drawing/2016/5/11/chartex" xmlns:cx6="http://schemas.microsoft.com/office/drawing/2016/5/12/chartex" xmlns:cx7="http://schemas.microsoft.com/office/drawing/2016/5/13/chartex" xmlns:cx8="http://schemas.microsoft.com/office/drawing/2016/5/14/chartex" xmlns:mc="http://schemas.openxmlformats.org/markup-compatibility/2006" xmlns:aink="http://schemas.microsoft.com/office/drawing/2016/ink" xmlns:am3d="http://schemas.microsoft.com/office/drawing/2017/model3d" xmlns:o="urn:schemas-microsoft-com:office:office" xmlns:oel="http://schemas.microsoft.com/office/2019/extlst" xmlns:r="http://schemas.openxmlformats.org/officeDocument/2006/relationships" xmlns:m="http://schemas.openxmlformats.org/officeDocument/2006/math" xmlns:v="urn:schemas-microsoft-com:vml" xmlns:wp14="http://schemas.microsoft.com/office/word/2010/wordprocessingDrawing" xmlns:wp="http://schemas.openxmlformats.org/drawingml/2006/wordprocessingDrawing" xmlns:w10="urn:schemas-microsoft-com:office:word" xmlns:w="http://schemas.openxmlformats.org/wordprocessingml/2006/main" xmlns:w14="http://schemas.microsoft.com/office/word/2010/wordml" xmlns:w15="http://schemas.microsoft.com/office/word/2012/wordml" xmlns:w16cex="http://schemas.microsoft.com/office/word/2018/wordml/cex" xmlns:w16cid="http://schemas.microsoft.com/office/word/2016/wordml/cid" xmlns:w16="http://schemas.microsoft.com/office/word/2018/wordml" xmlns:w16du="http://schemas.microsoft.com/office/word/2023/wordml/word16du" xmlns:w16sdtdh="http://schemas.microsoft.com/office/word/2020/wordml/sdtdatahash" xmlns:w16sdtfl="http://schemas.microsoft.com/office/word/2024/wordml/sdtformatlock" xmlns:w16se="http://schemas.microsoft.com/office/word/2015/wordml/symex" xmlns:wpg="http://schemas.microsoft.com/office/word/2010/wordprocessingGroup" xmlns:wpi="http://schemas.microsoft.com/office/word/2010/wordprocessingInk" xmlns:wne="http://schemas.microsoft.com/office/word/2006/wordml" xmlns:wps="http://schemas.microsoft.com/office/word/2010/wordprocessingShape" mc:Ignorable="w14 w15 w16se w16cid w16 w16cex w16sdtdh w16sdtfl w16du wp14">
   <w:body>
     <w:p>
       <w:pPr>
@@ -111,10 +111,10 @@
         <w:tblLook w:val="04A0" w:firstRow="1" w:lastRow="0" w:firstColumn="1" w:lastColumn="0" w:noHBand="0" w:noVBand="1"/>
       </w:tblPr>
       <w:tblGrid>
-        <w:gridCol w:w="1236"/>
-        <w:gridCol w:w="2247"/>
+        <w:gridCol w:w="1195"/>
+        <w:gridCol w:w="1689"/>
         <w:gridCol w:w="1102"/>
-        <w:gridCol w:w="4765"/>
+        <w:gridCol w:w="5364"/>
       </w:tblGrid>
       <w:tr>
         <w:tc>
@@ -436,8 +436,7 @@
           <w:p>
             <w:pPr>
               <w:rPr>
-                <w:b/>
-                <w:bCs/>
+                <w:rFonts w:ascii="Calibri" w:eastAsia="Calibri" w:hAnsi="Calibri" w:cs="Times New Roman"/>
               </w:rPr>
             </w:pPr>
             <m:oMathPara>
@@ -447,6 +446,95 @@
                     <m:ctrlPr>
                       <w:rPr>
                         <w:rFonts w:ascii="Cambria Math" w:hAnsi="Cambria Math"/>
+                        <w:i/>
+                      </w:rPr>
+                    </m:ctrlPr>
+                  </m:sSubPr>
+                  <m:e>
+                    <m:r>
+                      <w:rPr>
+                        <w:rFonts w:ascii="Cambria Math" w:hAnsi="Cambria Math"/>
+                      </w:rPr>
+                      <m:t>i</m:t>
+                    </m:r>
+                  </m:e>
+                  <m:sub>
+                    <m:r>
+                      <w:rPr>
+                        <w:rFonts w:ascii="Cambria Math" w:hAnsi="Cambria Math"/>
+                      </w:rPr>
+                      <m:t>c</m:t>
+                    </m:r>
+                  </m:sub>
+                </m:sSub>
+              </m:oMath>
+            </m:oMathPara>
+          </w:p>
+        </w:tc>
+        <w:tc>
+          <w:tcPr>
+            <w:tcW w:w="2247" w:type="dxa"/>
+          </w:tcPr>
+          <w:p>
+            <w:r>
+              <w:t>Daily incidence rate from uncomplicated to complicated SAM</w:t>
+            </w:r>
+          </w:p>
+        </w:tc>
+        <w:tc>
+          <w:tcPr>
+            <w:tcW w:w="1102" w:type="dxa"/>
+          </w:tcPr>
+          <w:p>
+            <w:r>
+              <w:t>Known</w:t>
+            </w:r>
+          </w:p>
+        </w:tc>
+        <w:tc>
+          <w:tcPr>
+            <w:tcW w:w="4765" w:type="dxa"/>
+          </w:tcPr>
+          <w:p>
+            <w:r>
+              <w:t>Derived from sampled value of proportion of uncomplicated SAM cases who are referred to inpatient treatment after enrolling in outpatient treatment (parameter=</w:t>
+            </w:r>
+            <w:proofErr w:type="spellStart"/>
+            <w:r>
+              <w:t>complicated_sam_deterioration_proportion</w:t>
+            </w:r>
+            <w:proofErr w:type="spellEnd"/>
+            <w:r>
+              <w:t>) and the time to recovery of uncomplicated SAM with outpatient treatment parameter.</w:t>
+            </w:r>
+          </w:p>
+          <w:p/>
+          <w:p>
+            <w:r>
+              <w:t xml:space="preserve">Derivation: </w:t>
+            </w:r>
+          </w:p>
+        </w:tc>
+      </w:tr>
+      <w:tr>
+        <w:tc>
+          <w:tcPr>
+            <w:tcW w:w="1236" w:type="dxa"/>
+          </w:tcPr>
+          <w:p>
+            <w:pPr>
+              <w:rPr>
+                <w:b/>
+                <w:bCs/>
+              </w:rPr>
+            </w:pPr>
+            <m:oMathPara>
+              <m:oMath>
+                <m:sSub>
+                  <m:sSubPr>
+                    <m:ctrlPr>
+                      <w:rPr>
+                        <w:rFonts w:ascii="Cambria Math" w:hAnsi="Cambria Math"/>
                         <w:b/>
                         <w:bCs/>
                         <w:i/>
@@ -1349,13 +1437,7 @@
           </w:tcPr>
           <w:p>
             <w:r>
-              <w:t xml:space="preserve">Probability of “birth” into </w:t>
-            </w:r>
-            <w:r>
-              <w:t>mild</w:t>
-            </w:r>
-            <w:r>
-              <w:t xml:space="preserve"> from death pool</w:t>
+              <w:t>Probability of “birth” into mild from death pool</w:t>
             </w:r>
           </w:p>
         </w:tc>
@@ -2616,6 +2698,7 @@
           </w:tcPr>
           <w:p>
             <w:r>
+              <w:lastRenderedPageBreak/>
               <w:t>Eq1</w:t>
             </w:r>
             <w:r>
@@ -4533,13 +4616,7 @@
                       <w:rPr>
                         <w:rFonts w:ascii="Cambria Math" w:eastAsia="Calibri" w:hAnsi="Cambria Math" w:cs="Times New Roman"/>
                       </w:rPr>
-                      <m:t>rate to prob(</m:t>
-                    </m:r>
-                    <m:r>
-                      <w:rPr>
-                        <w:rFonts w:ascii="Cambria Math" w:eastAsia="Calibri" w:hAnsi="Cambria Math" w:cs="Times New Roman"/>
-                      </w:rPr>
-                      <m:t>r</m:t>
+                      <m:t>rate to prob(r</m:t>
                     </m:r>
                   </m:e>
                   <m:sub>
@@ -4555,8 +4632,34 @@
                   <w:rPr>
                     <w:rFonts w:ascii="Cambria Math" w:eastAsia="Calibri" w:hAnsi="Cambria Math" w:cs="Times New Roman"/>
                   </w:rPr>
-                  <m:t>)</m:t>
+                  <m:t>)*</m:t>
                 </m:r>
+                <m:sSub>
+                  <m:sSubPr>
+                    <m:ctrlPr>
+                      <w:rPr>
+                        <w:rFonts w:ascii="Cambria Math" w:eastAsia="Calibri" w:hAnsi="Cambria Math" w:cs="Times New Roman"/>
+                        <w:i/>
+                      </w:rPr>
+                    </m:ctrlPr>
+                  </m:sSubPr>
+                  <m:e>
+                    <m:r>
+                      <w:rPr>
+                        <w:rFonts w:ascii="Cambria Math" w:eastAsia="Calibri" w:hAnsi="Cambria Math" w:cs="Times New Roman"/>
+                      </w:rPr>
+                      <m:t>C</m:t>
+                    </m:r>
+                  </m:e>
+                  <m:sub>
+                    <m:r>
+                      <w:rPr>
+                        <w:rFonts w:ascii="Cambria Math" w:eastAsia="Calibri" w:hAnsi="Cambria Math" w:cs="Times New Roman"/>
+                      </w:rPr>
+                      <m:t>MAM</m:t>
+                    </m:r>
+                  </m:sub>
+                </m:sSub>
                 <m:r>
                   <w:rPr>
                     <w:rFonts w:ascii="Cambria Math" w:eastAsia="Calibri" w:hAnsi="Cambria Math" w:cs="Times New Roman"/>
@@ -4577,38 +4680,6 @@
                       <w:rPr>
                         <w:rFonts w:ascii="Cambria Math" w:eastAsia="Calibri" w:hAnsi="Cambria Math" w:cs="Times New Roman"/>
                       </w:rPr>
-                      <m:t>C</m:t>
-                    </m:r>
-                  </m:e>
-                  <m:sub>
-                    <m:r>
-                      <w:rPr>
-                        <w:rFonts w:ascii="Cambria Math" w:eastAsia="Calibri" w:hAnsi="Cambria Math" w:cs="Times New Roman"/>
-                      </w:rPr>
-                      <m:t>MAM</m:t>
-                    </m:r>
-                  </m:sub>
-                </m:sSub>
-                <m:r>
-                  <w:rPr>
-                    <w:rFonts w:ascii="Cambria Math" w:eastAsia="Calibri" w:hAnsi="Cambria Math" w:cs="Times New Roman"/>
-                  </w:rPr>
-                  <m:t>*</m:t>
-                </m:r>
-                <m:sSub>
-                  <m:sSubPr>
-                    <m:ctrlPr>
-                      <w:rPr>
-                        <w:rFonts w:ascii="Cambria Math" w:eastAsia="Calibri" w:hAnsi="Cambria Math" w:cs="Times New Roman"/>
-                        <w:i/>
-                      </w:rPr>
-                    </m:ctrlPr>
-                  </m:sSubPr>
-                  <m:e>
-                    <m:r>
-                      <w:rPr>
-                        <w:rFonts w:ascii="Cambria Math" w:eastAsia="Calibri" w:hAnsi="Cambria Math" w:cs="Times New Roman"/>
-                      </w:rPr>
                       <m:t>E</m:t>
                     </m:r>
                   </m:e>
@@ -4641,13 +4712,7 @@
                       <w:rPr>
                         <w:rFonts w:ascii="Cambria Math" w:eastAsia="Calibri" w:hAnsi="Cambria Math" w:cs="Times New Roman"/>
                       </w:rPr>
-                      <m:t>rate to prob(</m:t>
-                    </m:r>
-                    <m:r>
-                      <w:rPr>
-                        <w:rFonts w:ascii="Cambria Math" w:eastAsia="Calibri" w:hAnsi="Cambria Math" w:cs="Times New Roman"/>
-                      </w:rPr>
-                      <m:t>r</m:t>
+                      <m:t>rate to prob(r</m:t>
                     </m:r>
                   </m:e>
                   <m:sub>
@@ -4663,13 +4728,7 @@
                   <w:rPr>
                     <w:rFonts w:ascii="Cambria Math" w:eastAsia="Calibri" w:hAnsi="Cambria Math" w:cs="Times New Roman"/>
                   </w:rPr>
-                  <m:t>)</m:t>
-                </m:r>
-                <m:r>
-                  <w:rPr>
-                    <w:rFonts w:ascii="Cambria Math" w:eastAsia="Calibri" w:hAnsi="Cambria Math" w:cs="Times New Roman"/>
-                  </w:rPr>
-                  <m:t>*</m:t>
+                  <m:t>)*</m:t>
                 </m:r>
                 <m:d>
                   <m:dPr>
@@ -6212,7 +6271,7 @@
 </file>
 
 <file path=word/styles.xml><?xml version="1.0" encoding="utf-8"?>
-<w:styles xmlns:mc="http://schemas.openxmlformats.org/markup-compatibility/2006" xmlns:r="http://schemas.openxmlformats.org/officeDocument/2006/relationships" xmlns:w="http://schemas.openxmlformats.org/wordprocessingml/2006/main" xmlns:w14="http://schemas.microsoft.com/office/word/2010/wordml" xmlns:w15="http://schemas.microsoft.com/office/word/2012/wordml" xmlns:w16cex="http://schemas.microsoft.com/office/word/2018/wordml/cex" xmlns:w16cid="http://schemas.microsoft.com/office/word/2016/wordml/cid" xmlns:w16="http://schemas.microsoft.com/office/word/2018/wordml" xmlns:w16sdtdh="http://schemas.microsoft.com/office/word/2020/wordml/sdtdatahash" xmlns:w16se="http://schemas.microsoft.com/office/word/2015/wordml/symex" mc:Ignorable="w14 w15 w16se w16cid w16 w16cex w16sdtdh">
+<w:styles xmlns:mc="http://schemas.openxmlformats.org/markup-compatibility/2006" xmlns:r="http://schemas.openxmlformats.org/officeDocument/2006/relationships" xmlns:w="http://schemas.openxmlformats.org/wordprocessingml/2006/main" xmlns:w14="http://schemas.microsoft.com/office/word/2010/wordml" xmlns:w15="http://schemas.microsoft.com/office/word/2012/wordml" xmlns:w16cex="http://schemas.microsoft.com/office/word/2018/wordml/cex" xmlns:w16cid="http://schemas.microsoft.com/office/word/2016/wordml/cid" xmlns:w16="http://schemas.microsoft.com/office/word/2018/wordml" xmlns:w16du="http://schemas.microsoft.com/office/word/2023/wordml/word16du" xmlns:w16sdtdh="http://schemas.microsoft.com/office/word/2020/wordml/sdtdatahash" xmlns:w16sdtfl="http://schemas.microsoft.com/office/word/2024/wordml/sdtformatlock" xmlns:w16se="http://schemas.microsoft.com/office/word/2015/wordml/symex" mc:Ignorable="w14 w15 w16se w16cid w16 w16cex w16sdtdh w16sdtfl w16du">
   <w:docDefaults>
     <w:rPrDefault>
       <w:rPr>
@@ -6613,6 +6672,7 @@
   <w:style w:type="character" w:default="1" w:styleId="DefaultParagraphFont">
     <w:name w:val="Default Paragraph Font"/>
     <w:uiPriority w:val="1"/>
+    <w:semiHidden/>
     <w:unhideWhenUsed/>
   </w:style>
   <w:style w:type="table" w:default="1" w:styleId="TableNormal">

</xml_diff>